<commit_message>
Added Exercises to Session 2. Added --tittle to VCD python script
</commit_message>
<xml_diff>
--- a/Session2_ECD_Conformational_Averaging_Handout.docx
+++ b/Session2_ECD_Conformational_Averaging_Handout.docx
@@ -3753,33 +3753,33 @@
                 <w:sz w:val="17"/>
                 <w:szCs w:val="17"/>
               </w:rPr>
-              <w:t xml:space="preserve"> </w:t>
-            </w:r>
-          </w:p>
-          <w:p>
-            <w:pPr>
-              <w:spacing w:after="20"/>
-            </w:pPr>
-            <w:r>
-              <w:rPr>
-                <w:rFonts w:ascii="Courier New" w:cs="Courier New" w:eastAsia="Courier New" w:hAnsi="Courier New"/>
-                <w:sz w:val="17"/>
-                <w:szCs w:val="17"/>
-              </w:rPr>
-              <w:t xml:space="preserve">  \</w:t>
-            </w:r>
-          </w:p>
-          <w:p>
-            <w:pPr>
-              <w:spacing w:after="20"/>
-            </w:pPr>
-            <w:r>
-              <w:rPr>
-                <w:rFonts w:ascii="Courier New" w:cs="Courier New" w:eastAsia="Courier New" w:hAnsi="Courier New"/>
-                <w:sz w:val="17"/>
-                <w:szCs w:val="17"/>
-              </w:rPr>
-              <w:t xml:space="preserve">  \</w:t>
+              <w:t xml:space="preserve">python3 or_ecd_uvvis_tools.py ephedrine/05_ecd/confN/confN.log \</w:t>
+            </w:r>
+          </w:p>
+          <w:p>
+            <w:pPr>
+              <w:spacing w:after="20"/>
+            </w:pPr>
+            <w:r>
+              <w:rPr>
+                <w:rFonts w:ascii="Courier New" w:cs="Courier New" w:eastAsia="Courier New" w:hAnsi="Courier New"/>
+                <w:sz w:val="17"/>
+                <w:szCs w:val="17"/>
+              </w:rPr>
+              <w:t xml:space="preserve">  --bw ephedrine/04_boltzmann/ephedrine_energies.dat \</w:t>
+            </w:r>
+          </w:p>
+          <w:p>
+            <w:pPr>
+              <w:spacing w:after="20"/>
+            </w:pPr>
+            <w:r>
+              <w:rPr>
+                <w:rFonts w:ascii="Courier New" w:cs="Courier New" w:eastAsia="Courier New" w:hAnsi="Courier New"/>
+                <w:sz w:val="17"/>
+                <w:szCs w:val="17"/>
+              </w:rPr>
+              <w:t xml:space="preserve">  --outdir ephedrine/single_conf --stick --xlim 190 350 --flip_x</w:t>
             </w:r>
           </w:p>
           <w:p>
@@ -4198,18 +4198,18 @@
     </w:p>
     <w:p>
       <w:pPr>
-        <w:pStyle w:val="Heading1"/>
-        <w:spacing w:before="360" w:after="160"/>
+        <w:pStyle w:val="Heading2"/>
+        <w:spacing w:before="280" w:after="120"/>
       </w:pPr>
       <w:r>
         <w:rPr>
           <w:rFonts w:ascii="Arial" w:cs="Arial" w:eastAsia="Arial" w:hAnsi="Arial"/>
           <w:b/>
           <w:bCs/>
-          <w:sz w:val="28"/>
-          <w:szCs w:val="28"/>
-        </w:rPr>
-        <w:t xml:space="preserve">Part 4: Comparison to Experimental ECD</w:t>
+          <w:sz w:val="24"/>
+          <w:szCs w:val="24"/>
+        </w:rPr>
+        <w:t xml:space="preserve">Exercise 3.4: Comparing Confab and CREST Conformer Search</w:t>
       </w:r>
     </w:p>
     <w:p>
@@ -4222,7 +4222,7 @@
           <w:sz w:val="20"/>
           <w:szCs w:val="20"/>
         </w:rPr>
-        <w:t xml:space="preserve">The final test of any computational spectroscopy workflow is comparison to experiment. Obtain the experimental ECD spectrum of (1R,2S)-ephedrine from the literature. Your instructor will provide a reference or you can search for published ECD data in journals such as Chirality, Tetrahedron, or the Journal of Organic Chemistry.</w:t>
+        <w:t xml:space="preserve">The baseline workflow uses Confab (Open Babel) for conformer generation because it is fast and widely available. An alternative is CREST (iMTD-GC algorithm), which uses a semiempirical GFN2-xTB potential and metadynamic sampling to explore conformational space more thoroughly, particularly for molecules with multiple interacting rotatable bonds. In this exercise you will re-run the conformer search using CREST and compare the resulting conformer ensemble and averaged ECD spectrum to your Confab baseline.</w:t>
       </w:r>
     </w:p>
     <w:p>
@@ -4235,79 +4235,7 @@
           <w:sz w:val="20"/>
           <w:szCs w:val="20"/>
         </w:rPr>
-        <w:t xml:space="preserve">When comparing computed and experimental ECD spectra, keep the following in mind:</w:t>
-      </w:r>
-    </w:p>
-    <w:p>
-      <w:pPr>
-        <w:pStyle w:val="ListParagraph"/>
-        <w:numPr>
-          <w:ilvl w:val="0"/>
-          <w:numId w:val="2"/>
-        </w:numPr>
-        <w:spacing w:after="60"/>
-      </w:pPr>
-      <w:r>
-        <w:rPr>
-          <w:rFonts w:ascii="Arial" w:cs="Arial" w:eastAsia="Arial" w:hAnsi="Arial"/>
-          <w:sz w:val="20"/>
-          <w:szCs w:val="20"/>
-        </w:rPr>
-        <w:t xml:space="preserve">Sign pattern: The most important criterion. If the positive and negative bands appear in the same spectral regions as experiment, the computed absolute configuration is confirmed.</w:t>
-      </w:r>
-    </w:p>
-    <w:p>
-      <w:pPr>
-        <w:pStyle w:val="ListParagraph"/>
-        <w:numPr>
-          <w:ilvl w:val="0"/>
-          <w:numId w:val="2"/>
-        </w:numPr>
-        <w:spacing w:after="60"/>
-      </w:pPr>
-      <w:r>
-        <w:rPr>
-          <w:rFonts w:ascii="Arial" w:cs="Arial" w:eastAsia="Arial" w:hAnsi="Arial"/>
-          <w:sz w:val="20"/>
-          <w:szCs w:val="20"/>
-        </w:rPr>
-        <w:t xml:space="preserve">Band positions: TDDFT excitation energies are typically accurate to within 0.2-0.4 eV, so expect wavelength shifts of 10-30 nm compared to experiment.</w:t>
-      </w:r>
-    </w:p>
-    <w:p>
-      <w:pPr>
-        <w:pStyle w:val="ListParagraph"/>
-        <w:numPr>
-          <w:ilvl w:val="0"/>
-          <w:numId w:val="2"/>
-        </w:numPr>
-        <w:spacing w:after="60"/>
-      </w:pPr>
-      <w:r>
-        <w:rPr>
-          <w:rFonts w:ascii="Arial" w:cs="Arial" w:eastAsia="Arial" w:hAnsi="Arial"/>
-          <w:sz w:val="20"/>
-          <w:szCs w:val="20"/>
-        </w:rPr>
-        <w:t xml:space="preserve">Band intensities: Absolute rotatory strengths are harder to reproduce than signs. Relative band heights are more informative than absolute magnitudes.</w:t>
-      </w:r>
-    </w:p>
-    <w:p>
-      <w:pPr>
-        <w:pStyle w:val="ListParagraph"/>
-        <w:numPr>
-          <w:ilvl w:val="0"/>
-          <w:numId w:val="2"/>
-        </w:numPr>
-        <w:spacing w:after="60"/>
-      </w:pPr>
-      <w:r>
-        <w:rPr>
-          <w:rFonts w:ascii="Arial" w:cs="Arial" w:eastAsia="Arial" w:hAnsi="Arial"/>
-          <w:sz w:val="20"/>
-          <w:szCs w:val="20"/>
-        </w:rPr>
-        <w:t xml:space="preserve">Broadening: The FWHM parameter affects the visual appearance of the spectrum. You may need to adjust --fwhm to get a shape that visually resembles the experimental envelope.</w:t>
+        <w:t xml:space="preserve">First, rename your existing Confab results to preserve them, then run the CREST conformer search:</w:t>
       </w:r>
     </w:p>
     <w:tbl>
@@ -4335,7 +4263,7 @@
               <w:bottom w:val="single" w:color="AAAAAA" w:sz="1"/>
               <w:right w:val="single" w:color="AAAAAA" w:sz="1"/>
             </w:tcBorders>
-            <w:shd w:fill="E8DAEF" w:val="clear"/>
+            <w:shd w:fill="F2F2F2" w:val="clear"/>
             <w:tcMar>
               <w:top w:type="dxa" w:w="80"/>
               <w:left w:type="dxa" w:w="160"/>
@@ -4345,30 +4273,119 @@
           </w:tcPr>
           <w:p>
             <w:pPr>
-              <w:spacing w:after="60"/>
-            </w:pPr>
-            <w:r>
-              <w:rPr>
-                <w:rFonts w:ascii="Arial" w:cs="Arial" w:eastAsia="Arial" w:hAnsi="Arial"/>
-                <w:b/>
-                <w:bCs/>
-                <w:sz w:val="20"/>
-                <w:szCs w:val="20"/>
-              </w:rPr>
-              <w:t xml:space="preserve">Discussion Question 5:</w:t>
-            </w:r>
-          </w:p>
-          <w:p>
-            <w:pPr>
-              <w:spacing w:after="40"/>
-            </w:pPr>
-            <w:r>
-              <w:rPr>
-                <w:rFonts w:ascii="Arial" w:cs="Arial" w:eastAsia="Arial" w:hAnsi="Arial"/>
-                <w:sz w:val="19"/>
-                <w:szCs w:val="19"/>
-              </w:rPr>
-              <w:t xml:space="preserve">Based on your comparison, does your computed ECD spectrum support the (1R,2S) absolute configuration of ephedrine? What level of agreement would you consider sufficient to make a confident assignment in a research context? Refer to Pescitelli &amp; Bruhn (2016) for guidance.</w:t>
+              <w:spacing w:after="20"/>
+            </w:pPr>
+            <w:r>
+              <w:rPr>
+                <w:rFonts w:ascii="Courier New" w:cs="Courier New" w:eastAsia="Courier New" w:hAnsi="Courier New"/>
+                <w:sz w:val="17"/>
+                <w:szCs w:val="17"/>
+              </w:rPr>
+              <w:t xml:space="preserve"># Preserve Confab results</w:t>
+            </w:r>
+          </w:p>
+          <w:p>
+            <w:pPr>
+              <w:spacing w:after="20"/>
+            </w:pPr>
+            <w:r>
+              <w:rPr>
+                <w:rFonts w:ascii="Courier New" w:cs="Courier New" w:eastAsia="Courier New" w:hAnsi="Courier New"/>
+                <w:sz w:val="17"/>
+                <w:szCs w:val="17"/>
+              </w:rPr>
+              <w:t xml:space="preserve">mv ephedrine/02_conf_search ephedrine/02_conf_search_confab</w:t>
+            </w:r>
+          </w:p>
+          <w:p>
+            <w:pPr>
+              <w:spacing w:after="20"/>
+            </w:pPr>
+            <w:r>
+              <w:rPr>
+                <w:rFonts w:ascii="Courier New" w:cs="Courier New" w:eastAsia="Courier New" w:hAnsi="Courier New"/>
+                <w:sz w:val="17"/>
+                <w:szCs w:val="17"/>
+              </w:rPr>
+              <w:t xml:space="preserve"> </w:t>
+            </w:r>
+          </w:p>
+          <w:p>
+            <w:pPr>
+              <w:spacing w:after="20"/>
+            </w:pPr>
+            <w:r>
+              <w:rPr>
+                <w:rFonts w:ascii="Courier New" w:cs="Courier New" w:eastAsia="Courier New" w:hAnsi="Courier New"/>
+                <w:sz w:val="17"/>
+                <w:szCs w:val="17"/>
+              </w:rPr>
+              <w:t xml:space="preserve"># Run CREST conformer search</w:t>
+            </w:r>
+          </w:p>
+          <w:p>
+            <w:pPr>
+              <w:spacing w:after="20"/>
+            </w:pPr>
+            <w:r>
+              <w:rPr>
+                <w:rFonts w:ascii="Courier New" w:cs="Courier New" w:eastAsia="Courier New" w:hAnsi="Courier New"/>
+                <w:sz w:val="17"/>
+                <w:szCs w:val="17"/>
+              </w:rPr>
+              <w:t xml:space="preserve">./2b-crest-conf-search.sh molecules.txt</w:t>
+            </w:r>
+          </w:p>
+          <w:p>
+            <w:pPr>
+              <w:spacing w:after="20"/>
+            </w:pPr>
+            <w:r>
+              <w:rPr>
+                <w:rFonts w:ascii="Courier New" w:cs="Courier New" w:eastAsia="Courier New" w:hAnsi="Courier New"/>
+                <w:sz w:val="17"/>
+                <w:szCs w:val="17"/>
+              </w:rPr>
+              <w:t xml:space="preserve"> </w:t>
+            </w:r>
+          </w:p>
+          <w:p>
+            <w:pPr>
+              <w:spacing w:after="20"/>
+            </w:pPr>
+            <w:r>
+              <w:rPr>
+                <w:rFonts w:ascii="Courier New" w:cs="Courier New" w:eastAsia="Courier New" w:hAnsi="Courier New"/>
+                <w:sz w:val="17"/>
+                <w:szCs w:val="17"/>
+              </w:rPr>
+              <w:t xml:space="preserve"># Compare conformer counts</w:t>
+            </w:r>
+          </w:p>
+          <w:p>
+            <w:pPr>
+              <w:spacing w:after="20"/>
+            </w:pPr>
+            <w:r>
+              <w:rPr>
+                <w:rFonts w:ascii="Courier New" w:cs="Courier New" w:eastAsia="Courier New" w:hAnsi="Courier New"/>
+                <w:sz w:val="17"/>
+                <w:szCs w:val="17"/>
+              </w:rPr>
+              <w:t xml:space="preserve">ls ephedrine/02_conf_search_confab/split_xyz/*.xyz | wc -l</w:t>
+            </w:r>
+          </w:p>
+          <w:p>
+            <w:pPr>
+              <w:spacing w:after="20"/>
+            </w:pPr>
+            <w:r>
+              <w:rPr>
+                <w:rFonts w:ascii="Courier New" w:cs="Courier New" w:eastAsia="Courier New" w:hAnsi="Courier New"/>
+                <w:sz w:val="17"/>
+                <w:szCs w:val="17"/>
+              </w:rPr>
+              <w:t xml:space="preserve">ls ephedrine/02_conf_search/split_xyz/*.xyz | wc -l</w:t>
             </w:r>
           </w:p>
         </w:tc>
@@ -4376,8 +4393,16 @@
     </w:tbl>
     <w:p>
       <w:pPr>
-        <w:spacing w:after="80"/>
-      </w:pPr>
+        <w:spacing w:after="120"/>
+      </w:pPr>
+      <w:r>
+        <w:rPr>
+          <w:rFonts w:ascii="Arial" w:cs="Arial" w:eastAsia="Arial" w:hAnsi="Arial"/>
+          <w:sz w:val="20"/>
+          <w:szCs w:val="20"/>
+        </w:rPr>
+        <w:t xml:space="preserve">Then re-run Stages 3-6 with the CREST conformer set and re-plot the ECD spectrum. Compare the CREST result to your Confab baseline.</w:t>
+      </w:r>
     </w:p>
     <w:tbl>
       <w:tblPr>
@@ -4399,12 +4424,12 @@
           <w:tcPr>
             <w:tcW w:type="dxa" w:w="9360"/>
             <w:tcBorders>
-              <w:top w:val="single" w:color="AAAAAA" w:sz="1"/>
-              <w:left w:val="single" w:color="AAAAAA" w:sz="1"/>
-              <w:bottom w:val="single" w:color="AAAAAA" w:sz="1"/>
-              <w:right w:val="single" w:color="AAAAAA" w:sz="1"/>
-            </w:tcBorders>
-            <w:shd w:fill="E8DAEF" w:val="clear"/>
+              <w:top w:val="single" w:color="2E75B6" w:sz="4"/>
+              <w:left w:val="single" w:color="2E75B6" w:sz="4"/>
+              <w:bottom w:val="single" w:color="2E75B6" w:sz="4"/>
+              <w:right w:val="single" w:color="2E75B6" w:sz="4"/>
+            </w:tcBorders>
+            <w:shd w:fill="D9E2F3" w:val="clear"/>
             <w:tcMar>
               <w:top w:type="dxa" w:w="80"/>
               <w:left w:type="dxa" w:w="160"/>
@@ -4414,7 +4439,7 @@
           </w:tcPr>
           <w:p>
             <w:pPr>
-              <w:spacing w:after="60"/>
+              <w:spacing w:after="40"/>
             </w:pPr>
             <w:r>
               <w:rPr>
@@ -4424,7 +4449,7 @@
                 <w:sz w:val="20"/>
                 <w:szCs w:val="20"/>
               </w:rPr>
-              <w:t xml:space="preserve">Discussion Question 6:</w:t>
+              <w:t xml:space="preserve">Discussion Question 7:</w:t>
             </w:r>
           </w:p>
           <w:p>
@@ -4434,20 +4459,15 @@
             <w:r>
               <w:rPr>
                 <w:rFonts w:ascii="Arial" w:cs="Arial" w:eastAsia="Arial" w:hAnsi="Arial"/>
-                <w:sz w:val="19"/>
-                <w:szCs w:val="19"/>
-              </w:rPr>
-              <w:t xml:space="preserve">Reflect on the entire two-session workflow. If you were starting a new research project that required computing an ECD spectrum for a molecule you had never studied before, what would your step-by-step protocol be? What would you check at each stage to ensure the quality of your results?</w:t>
+                <w:sz w:val="20"/>
+                <w:szCs w:val="20"/>
+              </w:rPr>
+              <w:t xml:space="preserve">How does the number of conformers generated by CREST compare to Confab? Does the Boltzmann-averaged ECD spectrum change when the CREST ensemble is used? What does any difference tell you about the completeness of the Confab conformer search for ephedrine? Which method would you recommend for a molecule with more rotatable bonds, and why?</w:t>
             </w:r>
           </w:p>
         </w:tc>
       </w:tr>
     </w:tbl>
-    <w:p>
-      <w:pPr>
-        <w:spacing w:after="80"/>
-      </w:pPr>
-    </w:p>
     <w:p>
       <w:pPr>
         <w:pStyle w:val="Heading1"/>
@@ -4461,7 +4481,7 @@
           <w:sz w:val="28"/>
           <w:szCs w:val="28"/>
         </w:rPr>
-        <w:t xml:space="preserve">Part 5: Summary and Report Preparation</w:t>
+        <w:t xml:space="preserve">Part 4: Comparison to Experimental ECD</w:t>
       </w:r>
     </w:p>
     <w:p>
@@ -4474,17 +4494,12 @@
           <w:sz w:val="20"/>
           <w:szCs w:val="20"/>
         </w:rPr>
-        <w:t xml:space="preserve">Compile your results into a short report (2-3 pages) that includes:</w:t>
-      </w:r>
-    </w:p>
-    <w:p>
-      <w:pPr>
-        <w:pStyle w:val="ListParagraph"/>
-        <w:numPr>
-          <w:ilvl w:val="0"/>
-          <w:numId w:val="3"/>
-        </w:numPr>
-        <w:spacing w:after="80"/>
+        <w:t xml:space="preserve">The final test of any computational spectroscopy workflow is comparison to experiment. Obtain the experimental ECD spectrum of (1R,2S)-ephedrine from the literature. Your instructor will provide a reference or you can search for published ECD data in journals such as Chirality, Tetrahedron, or the Journal of Organic Chemistry.</w:t>
+      </w:r>
+    </w:p>
+    <w:p>
+      <w:pPr>
+        <w:spacing w:after="120"/>
       </w:pPr>
       <w:r>
         <w:rPr>
@@ -4492,100 +4507,7 @@
           <w:sz w:val="20"/>
           <w:szCs w:val="20"/>
         </w:rPr>
-        <w:t xml:space="preserve">A description of the molecule, its conformational flexibility, and why conformer treatment matters for ECD.</w:t>
-      </w:r>
-    </w:p>
-    <w:p>
-      <w:pPr>
-        <w:pStyle w:val="ListParagraph"/>
-        <w:numPr>
-          <w:ilvl w:val="0"/>
-          <w:numId w:val="3"/>
-        </w:numPr>
-        <w:spacing w:after="80"/>
-      </w:pPr>
-      <w:r>
-        <w:rPr>
-          <w:rFonts w:ascii="Arial" w:cs="Arial" w:eastAsia="Arial" w:hAnsi="Arial"/>
-          <w:sz w:val="20"/>
-          <w:szCs w:val="20"/>
-        </w:rPr>
-        <w:t xml:space="preserve">Your Boltzmann population table showing the conformers that contributed to the final spectrum.</w:t>
-      </w:r>
-    </w:p>
-    <w:p>
-      <w:pPr>
-        <w:pStyle w:val="ListParagraph"/>
-        <w:numPr>
-          <w:ilvl w:val="0"/>
-          <w:numId w:val="3"/>
-        </w:numPr>
-        <w:spacing w:after="80"/>
-      </w:pPr>
-      <w:r>
-        <w:rPr>
-          <w:rFonts w:ascii="Arial" w:cs="Arial" w:eastAsia="Arial" w:hAnsi="Arial"/>
-          <w:sz w:val="20"/>
-          <w:szCs w:val="20"/>
-        </w:rPr>
-        <w:t xml:space="preserve">Figures showing (a) the full Boltzmann-averaged ECD spectrum, (b) a comparison with the single lowest-energy conformer, and (c) a comparison with experimental data.</w:t>
-      </w:r>
-    </w:p>
-    <w:p>
-      <w:pPr>
-        <w:pStyle w:val="ListParagraph"/>
-        <w:numPr>
-          <w:ilvl w:val="0"/>
-          <w:numId w:val="3"/>
-        </w:numPr>
-        <w:spacing w:after="80"/>
-      </w:pPr>
-      <w:r>
-        <w:rPr>
-          <w:rFonts w:ascii="Arial" w:cs="Arial" w:eastAsia="Arial" w:hAnsi="Arial"/>
-          <w:sz w:val="20"/>
-          <w:szCs w:val="20"/>
-        </w:rPr>
-        <w:t xml:space="preserve">A discussion of how the energy cutoff or Boltzmann threshold affected the computed spectrum.</w:t>
-      </w:r>
-    </w:p>
-    <w:p>
-      <w:pPr>
-        <w:pStyle w:val="ListParagraph"/>
-        <w:numPr>
-          <w:ilvl w:val="0"/>
-          <w:numId w:val="3"/>
-        </w:numPr>
-        <w:spacing w:after="80"/>
-      </w:pPr>
-      <w:r>
-        <w:rPr>
-          <w:rFonts w:ascii="Arial" w:cs="Arial" w:eastAsia="Arial" w:hAnsi="Arial"/>
-          <w:sz w:val="20"/>
-          <w:szCs w:val="20"/>
-        </w:rPr>
-        <w:t xml:space="preserve">A final assessment of whether your computed ECD supports the known absolute configuration of (1R,2S)-ephedrine.</w:t>
-      </w:r>
-    </w:p>
-    <w:p>
-      <w:pPr>
-        <w:spacing w:after="120"/>
-      </w:pPr>
-    </w:p>
-    <w:p>
-      <w:pPr>
-        <w:pStyle w:val="Heading2"/>
-        <w:spacing w:before="280" w:after="120"/>
-      </w:pPr>
-      <w:r>
-        <w:rPr>
-          <w:rFonts w:ascii="Arial" w:cs="Arial" w:eastAsia="Arial" w:hAnsi="Arial"/>
-          <w:b/>
-          <w:bCs/>
-          <w:sz w:val="24"/>
-          <w:szCs w:val="24"/>
-        </w:rPr>
-        <w:t xml:space="preserve">Key References</w:t>
+        <w:t xml:space="preserve">When comparing computed and experimental ECD spectra, keep the following in mind:</w:t>
       </w:r>
     </w:p>
     <w:p>
@@ -4600,10 +4522,10 @@
       <w:r>
         <w:rPr>
           <w:rFonts w:ascii="Arial" w:cs="Arial" w:eastAsia="Arial" w:hAnsi="Arial"/>
-          <w:sz w:val="19"/>
-          <w:szCs w:val="19"/>
-        </w:rPr>
-        <w:t xml:space="preserve">Pescitelli, G.; Bruhn, T. Good Computational Practice in the Assignment of Absolute Configurations by TDDFT Calculations of ECD Spectra. Chirality 2016, 28, 466-474.</w:t>
+          <w:sz w:val="20"/>
+          <w:szCs w:val="20"/>
+        </w:rPr>
+        <w:t xml:space="preserve">Sign pattern: The most important criterion. If the positive and negative bands appear in the same spectral regions as experiment, the computed absolute configuration is confirmed.</w:t>
       </w:r>
     </w:p>
     <w:p>
@@ -4618,10 +4540,10 @@
       <w:r>
         <w:rPr>
           <w:rFonts w:ascii="Arial" w:cs="Arial" w:eastAsia="Arial" w:hAnsi="Arial"/>
-          <w:sz w:val="19"/>
-          <w:szCs w:val="19"/>
-        </w:rPr>
-        <w:t xml:space="preserve">Pescitelli, G.; Di Bari, L.; Berova, N. Conformational Aspects in the Studies of Organic Compounds by Electronic Circular Dichroism. Chem. Soc. Rev. 2011, 40, 4603-4625.</w:t>
+          <w:sz w:val="20"/>
+          <w:szCs w:val="20"/>
+        </w:rPr>
+        <w:t xml:space="preserve">Band positions: TDDFT excitation energies are typically accurate to within 0.2-0.4 eV, so expect wavelength shifts of 10-30 nm compared to experiment.</w:t>
       </w:r>
     </w:p>
     <w:p>
@@ -4636,16 +4558,29 @@
       <w:r>
         <w:rPr>
           <w:rFonts w:ascii="Arial" w:cs="Arial" w:eastAsia="Arial" w:hAnsi="Arial"/>
-          <w:sz w:val="19"/>
-          <w:szCs w:val="19"/>
-        </w:rPr>
-        <w:t xml:space="preserve">Laurent, A. D.; Jacquemin, D. TD-DFT Benchmarks: A Review. Int. J. Quantum Chem. 2013, 113, 2019-2039.</w:t>
-      </w:r>
-    </w:p>
-    <w:p>
-      <w:pPr>
-        <w:spacing w:after="200"/>
-      </w:pPr>
+          <w:sz w:val="20"/>
+          <w:szCs w:val="20"/>
+        </w:rPr>
+        <w:t xml:space="preserve">Band intensities: Absolute rotatory strengths are harder to reproduce than signs. Relative band heights are more informative than absolute magnitudes.</w:t>
+      </w:r>
+    </w:p>
+    <w:p>
+      <w:pPr>
+        <w:pStyle w:val="ListParagraph"/>
+        <w:numPr>
+          <w:ilvl w:val="0"/>
+          <w:numId w:val="2"/>
+        </w:numPr>
+        <w:spacing w:after="60"/>
+      </w:pPr>
+      <w:r>
+        <w:rPr>
+          <w:rFonts w:ascii="Arial" w:cs="Arial" w:eastAsia="Arial" w:hAnsi="Arial"/>
+          <w:sz w:val="20"/>
+          <w:szCs w:val="20"/>
+        </w:rPr>
+        <w:t xml:space="preserve">Broadening: The FWHM parameter affects the visual appearance of the spectrum. You may need to adjust --fwhm to get a shape that visually resembles the experimental envelope.</w:t>
+      </w:r>
     </w:p>
     <w:tbl>
       <w:tblPr>
@@ -4672,7 +4607,7 @@
               <w:bottom w:val="single" w:color="AAAAAA" w:sz="1"/>
               <w:right w:val="single" w:color="AAAAAA" w:sz="1"/>
             </w:tcBorders>
-            <w:shd w:fill="FFF3CD" w:val="clear"/>
+            <w:shd w:fill="E8DAEF" w:val="clear"/>
             <w:tcMar>
               <w:top w:type="dxa" w:w="80"/>
               <w:left w:type="dxa" w:w="160"/>
@@ -4692,7 +4627,7 @@
                 <w:sz w:val="20"/>
                 <w:szCs w:val="20"/>
               </w:rPr>
-              <w:t xml:space="preserve">Script Quick Reference</w:t>
+              <w:t xml:space="preserve">Discussion Question 5:</w:t>
             </w:r>
           </w:p>
           <w:p>
@@ -4705,7 +4640,63 @@
                 <w:sz w:val="19"/>
                 <w:szCs w:val="19"/>
               </w:rPr>
-              <w:t xml:space="preserve">Stage 1: ./1-orca-init-opt.sh [--method --basis --disp --cpus] molecules.txt</w:t>
+              <w:t xml:space="preserve">Based on your comparison, does your computed ECD spectrum support the (1R,2S) absolute configuration of ephedrine? What level of agreement would you consider sufficient to make a confident assignment in a research context? Refer to Pescitelli &amp; Bruhn (2016) for guidance.</w:t>
+            </w:r>
+          </w:p>
+        </w:tc>
+      </w:tr>
+    </w:tbl>
+    <w:p>
+      <w:pPr>
+        <w:spacing w:after="80"/>
+      </w:pPr>
+    </w:p>
+    <w:tbl>
+      <w:tblPr>
+        <w:tblW w:type="dxa" w:w="9360"/>
+        <w:tblBorders>
+          <w:top w:val="single" w:color="auto" w:sz="4"/>
+          <w:left w:val="single" w:color="auto" w:sz="4"/>
+          <w:bottom w:val="single" w:color="auto" w:sz="4"/>
+          <w:right w:val="single" w:color="auto" w:sz="4"/>
+          <w:insideH w:val="single" w:color="auto" w:sz="4"/>
+          <w:insideV w:val="single" w:color="auto" w:sz="4"/>
+        </w:tblBorders>
+      </w:tblPr>
+      <w:tblGrid>
+        <w:gridCol w:w="9360"/>
+      </w:tblGrid>
+      <w:tr>
+        <w:tc>
+          <w:tcPr>
+            <w:tcW w:type="dxa" w:w="9360"/>
+            <w:tcBorders>
+              <w:top w:val="single" w:color="AAAAAA" w:sz="1"/>
+              <w:left w:val="single" w:color="AAAAAA" w:sz="1"/>
+              <w:bottom w:val="single" w:color="AAAAAA" w:sz="1"/>
+              <w:right w:val="single" w:color="AAAAAA" w:sz="1"/>
+            </w:tcBorders>
+            <w:shd w:fill="E8DAEF" w:val="clear"/>
+            <w:tcMar>
+              <w:top w:type="dxa" w:w="80"/>
+              <w:left w:type="dxa" w:w="160"/>
+              <w:bottom w:type="dxa" w:w="80"/>
+              <w:right w:type="dxa" w:w="160"/>
+            </w:tcMar>
+          </w:tcPr>
+          <w:p>
+            <w:pPr>
+              <w:spacing w:after="60"/>
+            </w:pPr>
+            <w:r>
+              <w:rPr>
+                <w:rFonts w:ascii="Arial" w:cs="Arial" w:eastAsia="Arial" w:hAnsi="Arial"/>
+                <w:b/>
+                <w:bCs/>
+                <w:sz w:val="20"/>
+                <w:szCs w:val="20"/>
+              </w:rPr>
+              <w:t xml:space="preserve">Discussion Question 6:</w:t>
             </w:r>
           </w:p>
           <w:p>
@@ -4718,7 +4709,262 @@
                 <w:sz w:val="19"/>
                 <w:szCs w:val="19"/>
               </w:rPr>
-              <w:t xml:space="preserve">Stage 2: ./2-orca-conf-search.sh [--ecut --conf] molecules.txt</w:t>
+              <w:t xml:space="preserve">Reflect on the entire two-session workflow. If you were starting a new research project that required computing an ECD spectrum for a molecule you had never studied before, what would your step-by-step protocol be? What would you check at each stage to ensure the quality of your results?</w:t>
+            </w:r>
+          </w:p>
+        </w:tc>
+      </w:tr>
+    </w:tbl>
+    <w:p>
+      <w:pPr>
+        <w:spacing w:after="80"/>
+      </w:pPr>
+    </w:p>
+    <w:p>
+      <w:pPr>
+        <w:pStyle w:val="Heading1"/>
+        <w:spacing w:before="360" w:after="160"/>
+      </w:pPr>
+      <w:r>
+        <w:rPr>
+          <w:rFonts w:ascii="Arial" w:cs="Arial" w:eastAsia="Arial" w:hAnsi="Arial"/>
+          <w:b/>
+          <w:bCs/>
+          <w:sz w:val="28"/>
+          <w:szCs w:val="28"/>
+        </w:rPr>
+        <w:t xml:space="preserve">Part 5: Summary and Report Preparation</w:t>
+      </w:r>
+    </w:p>
+    <w:p>
+      <w:pPr>
+        <w:spacing w:after="120"/>
+      </w:pPr>
+      <w:r>
+        <w:rPr>
+          <w:rFonts w:ascii="Arial" w:cs="Arial" w:eastAsia="Arial" w:hAnsi="Arial"/>
+          <w:sz w:val="20"/>
+          <w:szCs w:val="20"/>
+        </w:rPr>
+        <w:t xml:space="preserve">Compile your results into a short report (2-3 pages) that includes:</w:t>
+      </w:r>
+    </w:p>
+    <w:p>
+      <w:pPr>
+        <w:pStyle w:val="ListParagraph"/>
+        <w:numPr>
+          <w:ilvl w:val="0"/>
+          <w:numId w:val="2"/>
+        </w:numPr>
+        <w:spacing w:after="80"/>
+      </w:pPr>
+      <w:r>
+        <w:rPr>
+          <w:rFonts w:ascii="Arial" w:cs="Arial" w:eastAsia="Arial" w:hAnsi="Arial"/>
+          <w:sz w:val="20"/>
+          <w:szCs w:val="20"/>
+        </w:rPr>
+        <w:t xml:space="preserve">A description of the molecule, its conformational flexibility, and why conformer treatment matters for ECD.</w:t>
+      </w:r>
+    </w:p>
+    <w:p>
+      <w:pPr>
+        <w:pStyle w:val="ListParagraph"/>
+        <w:numPr>
+          <w:ilvl w:val="0"/>
+          <w:numId w:val="2"/>
+        </w:numPr>
+        <w:spacing w:after="80"/>
+      </w:pPr>
+      <w:r>
+        <w:rPr>
+          <w:rFonts w:ascii="Arial" w:cs="Arial" w:eastAsia="Arial" w:hAnsi="Arial"/>
+          <w:sz w:val="20"/>
+          <w:szCs w:val="20"/>
+        </w:rPr>
+        <w:t xml:space="preserve">Your Boltzmann population table showing the conformers that contributed to the final spectrum.</w:t>
+      </w:r>
+    </w:p>
+    <w:p>
+      <w:pPr>
+        <w:pStyle w:val="ListParagraph"/>
+        <w:numPr>
+          <w:ilvl w:val="0"/>
+          <w:numId w:val="2"/>
+        </w:numPr>
+        <w:spacing w:after="80"/>
+      </w:pPr>
+      <w:r>
+        <w:rPr>
+          <w:rFonts w:ascii="Arial" w:cs="Arial" w:eastAsia="Arial" w:hAnsi="Arial"/>
+          <w:sz w:val="20"/>
+          <w:szCs w:val="20"/>
+        </w:rPr>
+        <w:t xml:space="preserve">Figures showing (a) the full Boltzmann-averaged ECD spectrum, (b) a comparison with the single lowest-energy conformer, and (c) a comparison with experimental data.</w:t>
+      </w:r>
+    </w:p>
+    <w:p>
+      <w:pPr>
+        <w:pStyle w:val="ListParagraph"/>
+        <w:numPr>
+          <w:ilvl w:val="0"/>
+          <w:numId w:val="2"/>
+        </w:numPr>
+        <w:spacing w:after="80"/>
+      </w:pPr>
+      <w:r>
+        <w:rPr>
+          <w:rFonts w:ascii="Arial" w:cs="Arial" w:eastAsia="Arial" w:hAnsi="Arial"/>
+          <w:sz w:val="20"/>
+          <w:szCs w:val="20"/>
+        </w:rPr>
+        <w:t xml:space="preserve">A discussion of how the energy cutoff or Boltzmann threshold affected the computed spectrum.</w:t>
+      </w:r>
+    </w:p>
+    <w:p>
+      <w:pPr>
+        <w:pStyle w:val="ListParagraph"/>
+        <w:numPr>
+          <w:ilvl w:val="0"/>
+          <w:numId w:val="2"/>
+        </w:numPr>
+        <w:spacing w:after="80"/>
+      </w:pPr>
+      <w:r>
+        <w:rPr>
+          <w:rFonts w:ascii="Arial" w:cs="Arial" w:eastAsia="Arial" w:hAnsi="Arial"/>
+          <w:sz w:val="20"/>
+          <w:szCs w:val="20"/>
+        </w:rPr>
+        <w:t xml:space="preserve">A final assessment of whether your computed ECD supports the known absolute configuration of (1R,2S)-ephedrine.</w:t>
+      </w:r>
+    </w:p>
+    <w:p>
+      <w:pPr>
+        <w:spacing w:after="120"/>
+      </w:pPr>
+    </w:p>
+    <w:p>
+      <w:pPr>
+        <w:pStyle w:val="Heading2"/>
+        <w:spacing w:before="280" w:after="120"/>
+      </w:pPr>
+      <w:r>
+        <w:rPr>
+          <w:rFonts w:ascii="Arial" w:cs="Arial" w:eastAsia="Arial" w:hAnsi="Arial"/>
+          <w:b/>
+          <w:bCs/>
+          <w:sz w:val="24"/>
+          <w:szCs w:val="24"/>
+        </w:rPr>
+        <w:t xml:space="preserve">Key References</w:t>
+      </w:r>
+    </w:p>
+    <w:p>
+      <w:pPr>
+        <w:pStyle w:val="ListParagraph"/>
+        <w:numPr>
+          <w:ilvl w:val="0"/>
+          <w:numId w:val="2"/>
+        </w:numPr>
+        <w:spacing w:after="60"/>
+      </w:pPr>
+      <w:r>
+        <w:rPr>
+          <w:rFonts w:ascii="Arial" w:cs="Arial" w:eastAsia="Arial" w:hAnsi="Arial"/>
+          <w:sz w:val="19"/>
+          <w:szCs w:val="19"/>
+        </w:rPr>
+        <w:t xml:space="preserve">Pescitelli, G.; Bruhn, T. Good Computational Practice in the Assignment of Absolute Configurations by TDDFT Calculations of ECD Spectra. Chirality 2016, 28, 466-474.</w:t>
+      </w:r>
+    </w:p>
+    <w:p>
+      <w:pPr>
+        <w:pStyle w:val="ListParagraph"/>
+        <w:numPr>
+          <w:ilvl w:val="0"/>
+          <w:numId w:val="2"/>
+        </w:numPr>
+        <w:spacing w:after="60"/>
+      </w:pPr>
+      <w:r>
+        <w:rPr>
+          <w:rFonts w:ascii="Arial" w:cs="Arial" w:eastAsia="Arial" w:hAnsi="Arial"/>
+          <w:sz w:val="19"/>
+          <w:szCs w:val="19"/>
+        </w:rPr>
+        <w:t xml:space="preserve">Pescitelli, G.; Di Bari, L.; Berova, N. Conformational Aspects in the Studies of Organic Compounds by Electronic Circular Dichroism. Chem. Soc. Rev. 2011, 40, 4603-4625.</w:t>
+      </w:r>
+    </w:p>
+    <w:p>
+      <w:pPr>
+        <w:pStyle w:val="ListParagraph"/>
+        <w:numPr>
+          <w:ilvl w:val="0"/>
+          <w:numId w:val="2"/>
+        </w:numPr>
+        <w:spacing w:after="60"/>
+      </w:pPr>
+      <w:r>
+        <w:rPr>
+          <w:rFonts w:ascii="Arial" w:cs="Arial" w:eastAsia="Arial" w:hAnsi="Arial"/>
+          <w:sz w:val="19"/>
+          <w:szCs w:val="19"/>
+        </w:rPr>
+        <w:t xml:space="preserve">Laurent, A. D.; Jacquemin, D. TD-DFT Benchmarks: A Review. Int. J. Quantum Chem. 2013, 113, 2019-2039.</w:t>
+      </w:r>
+    </w:p>
+    <w:p>
+      <w:pPr>
+        <w:spacing w:after="200"/>
+      </w:pPr>
+    </w:p>
+    <w:tbl>
+      <w:tblPr>
+        <w:tblW w:type="dxa" w:w="9360"/>
+        <w:tblBorders>
+          <w:top w:val="single" w:color="auto" w:sz="4"/>
+          <w:left w:val="single" w:color="auto" w:sz="4"/>
+          <w:bottom w:val="single" w:color="auto" w:sz="4"/>
+          <w:right w:val="single" w:color="auto" w:sz="4"/>
+          <w:insideH w:val="single" w:color="auto" w:sz="4"/>
+          <w:insideV w:val="single" w:color="auto" w:sz="4"/>
+        </w:tblBorders>
+      </w:tblPr>
+      <w:tblGrid>
+        <w:gridCol w:w="9360"/>
+      </w:tblGrid>
+      <w:tr>
+        <w:tc>
+          <w:tcPr>
+            <w:tcW w:type="dxa" w:w="9360"/>
+            <w:tcBorders>
+              <w:top w:val="single" w:color="AAAAAA" w:sz="1"/>
+              <w:left w:val="single" w:color="AAAAAA" w:sz="1"/>
+              <w:bottom w:val="single" w:color="AAAAAA" w:sz="1"/>
+              <w:right w:val="single" w:color="AAAAAA" w:sz="1"/>
+            </w:tcBorders>
+            <w:shd w:fill="FFF3CD" w:val="clear"/>
+            <w:tcMar>
+              <w:top w:type="dxa" w:w="80"/>
+              <w:left w:type="dxa" w:w="160"/>
+              <w:bottom w:type="dxa" w:w="80"/>
+              <w:right w:type="dxa" w:w="160"/>
+            </w:tcMar>
+          </w:tcPr>
+          <w:p>
+            <w:pPr>
+              <w:spacing w:after="60"/>
+            </w:pPr>
+            <w:r>
+              <w:rPr>
+                <w:rFonts w:ascii="Arial" w:cs="Arial" w:eastAsia="Arial" w:hAnsi="Arial"/>
+                <w:b/>
+                <w:bCs/>
+                <w:sz w:val="20"/>
+                <w:szCs w:val="20"/>
+              </w:rPr>
+              <w:t xml:space="preserve">Script Quick Reference</w:t>
             </w:r>
           </w:p>
           <w:p>
@@ -4731,7 +4977,7 @@
                 <w:sz w:val="19"/>
                 <w:szCs w:val="19"/>
               </w:rPr>
-              <w:t xml:space="preserve">Stage 4: ./4-orca-solvent-opt.sh [--method --basis --disp --solvent --cpus] molecules.txt</w:t>
+              <w:t xml:space="preserve">Stage 1: ./1-orca-init-opt.sh [--method --basis --disp --cpus] molecules.txt</w:t>
             </w:r>
           </w:p>
           <w:p>
@@ -4744,7 +4990,7 @@
                 <w:sz w:val="19"/>
                 <w:szCs w:val="19"/>
               </w:rPr>
-              <w:t xml:space="preserve">Stage 5: ./5-orca-boltzmann-weight.sh [--temp --p-cut] molecules.txt</w:t>
+              <w:t xml:space="preserve">Stage 2: ./2-orca-conf-search.sh [--ecut --conf] molecules.txt</w:t>
             </w:r>
           </w:p>
           <w:p>
@@ -4757,7 +5003,7 @@
                 <w:sz w:val="19"/>
                 <w:szCs w:val="19"/>
               </w:rPr>
-              <w:t xml:space="preserve">Stage 6: ./6-orca-ecd.sh [--method --basis --disp --solvent --roots --cpus] molecules.txt</w:t>
+              <w:t xml:space="preserve">Stage 4: ./4-orca-solvent-opt.sh [--method --basis --disp --solvent --cpus] molecules.txt</w:t>
             </w:r>
           </w:p>
           <w:p>
@@ -4770,7 +5016,33 @@
                 <w:sz w:val="19"/>
                 <w:szCs w:val="19"/>
               </w:rPr>
-              <w:t xml:space="preserve">Plot (ECD): python3 or_ecd_uvvis_tools.py ephedrine/05_ecd/**/*.log --bw ephedrine/04_boltzmann/ephedrine_energies.dat --outdir ephedrine --stick</w:t>
+              <w:t xml:space="preserve">Stage 5: ./5-orca-boltzmann-weight.sh [--temp --p-cut] molecules.txt</w:t>
+            </w:r>
+          </w:p>
+          <w:p>
+            <w:pPr>
+              <w:spacing w:after="40"/>
+            </w:pPr>
+            <w:r>
+              <w:rPr>
+                <w:rFonts w:ascii="Arial" w:cs="Arial" w:eastAsia="Arial" w:hAnsi="Arial"/>
+                <w:sz w:val="19"/>
+                <w:szCs w:val="19"/>
+              </w:rPr>
+              <w:t xml:space="preserve">Stage 6: ./6-orca-ecd.sh [--method --basis --disp --solvent --roots --cpus] molecules.txt</w:t>
+            </w:r>
+          </w:p>
+          <w:p>
+            <w:pPr>
+              <w:spacing w:after="40"/>
+            </w:pPr>
+            <w:r>
+              <w:rPr>
+                <w:rFonts w:ascii="Arial" w:cs="Arial" w:eastAsia="Arial" w:hAnsi="Arial"/>
+                <w:sz w:val="19"/>
+                <w:szCs w:val="19"/>
+              </w:rPr>
+              <w:t xml:space="preserve">Plot (ECD): python3 or_ecd_uvvis_tools.py ephedrine/05_ecd/**/*.log --bw ephedrine/04_boltzmann/ephedrine_energies.dat --outdir ephedrine --stick --flip_x</w:t>
             </w:r>
           </w:p>
           <w:p>

</xml_diff>